<commit_message>
fix(spec): the fresh review's findings (D61) — quotes, retries, tool limits, scope, converter
Prose quotes need 4+ words or a whole cell/item/statement and code evidence 12+ characters;
a missing output gets its retry (judge and verifier); unrecorded candidates fail rather than
become gaps; the batch driver limits subagents to .stangent/ by permission rules; the FSD
scope is the areas the FSD names (fixed before any judging run); typed heading numbers must
fit; shared files written atomically; stale comments list linked FSD sections; the depth
cut-off is recorded. D53, D58, D60, D62 refined.

Co-Authored-By: Claude Opus 5.5 <noreply@anthropic.com>
</commit_message>
<xml_diff>
--- a/benchmark/fsd/sonarr/sonarr-fsd.docx
+++ b/benchmark/fsd/sonarr/sonarr-fsd.docx
@@ -12,7 +12,7 @@
     </w:p>
     <w:p>
       <w:r>
-        <w:t xml:space="preserve">This document describes the screens of Sonarr, a TV series manager, as agreed with the client. It covers the library, the calendar, activity, wanted episodes, settings and backups.</w:t>
+        <w:t xml:space="preserve">This document describes the screens of Sonarr, a TV series manager, as agreed with the client. It covers the library, the calendar, activity, wanted episodes, settings and the system screens.</w:t>
       </w:r>
     </w:p>
     <w:p>
@@ -197,7 +197,7 @@
                     <pic:cNvPicPr/>
                   </pic:nvPicPr>
                   <pic:blipFill>
-                    <a:blip xmlns:r="http://schemas.openxmlformats.org/officeDocument/2006/relationships" r:embed="Rdf022efe8301467f"/>
+                    <a:blip xmlns:r="http://schemas.openxmlformats.org/officeDocument/2006/relationships" r:embed="R199eb158bd65490f"/>
                     <a:stretch>
                       <a:fillRect/>
                     </a:stretch>

</xml_diff>